<commit_message>
docs: use GitLab for control work mirror
</commit_message>
<xml_diff>
--- a/reports/Контрольная_работа_1_Инструменты_DevOps_Изосимов_МИ.docx
+++ b/reports/Контрольная_работа_1_Инструменты_DevOps_Изосимов_МИ.docx
@@ -59,7 +59,7 @@
           <w:color w:val="102D4D"/>
           <w:sz w:val="30"/>
         </w:rPr>
-        <w:t>«Комплексное применение Git и GitHub»</w:t>
+        <w:t>«Комплексное применение Git и GitVerse»</w:t>
       </w:r>
     </w:p>
     <w:tbl>
@@ -720,7 +720,7 @@
     </w:p>
     <w:p>
       <w:r>
-        <w:t>Исходный репозиторий преподавателя импортирован в публичный GitHub-репозиторий. Создан отдельный публичный mirror. Для origin заданы два push URL, поэтому одна команда git push отправляет изменения в основной репозиторий и зеркало.</w:t>
+        <w:t>Исходный репозиторий преподавателя на GitVerse импортирован в публичный GitHub-репозиторий. Отдельный публичный mirror создан на GitLab в соответствии с вариантом А задания. Для origin заданы два push URL, поэтому одна команда git push отправляет изменения в основной репозиторий и зеркало.</w:t>
       </w:r>
     </w:p>
     <w:p>
@@ -1336,7 +1336,7 @@
       <w:r>
         <w:drawing>
           <wp:inline xmlns:a="http://schemas.openxmlformats.org/drawingml/2006/main" xmlns:pic="http://schemas.openxmlformats.org/drawingml/2006/picture">
-            <wp:extent cx="5989320" cy="2487871"/>
+            <wp:extent cx="5989320" cy="3412313"/>
             <wp:docPr id="10" name="Picture 10"/>
             <wp:cNvGraphicFramePr>
               <a:graphicFrameLocks noChangeAspect="1"/>
@@ -1357,7 +1357,7 @@
                   <pic:spPr>
                     <a:xfrm>
                       <a:off x="0" y="0"/>
-                      <a:ext cx="5989320" cy="2487871"/>
+                      <a:ext cx="5989320" cy="3412313"/>
                     </a:xfrm>
                     <a:prstGeom prst="rect"/>
                   </pic:spPr>
@@ -1374,7 +1374,7 @@
         <w:jc w:val="center"/>
       </w:pPr>
       <w:r>
-        <w:t>Рисунок 10 — Тот же итоговый коммит в mirror-репозитории</w:t>
+        <w:t>Рисунок 10 — Итоговый коммит в mirror-репозитории на GitLab</w:t>
       </w:r>
     </w:p>
     <w:p>
@@ -1407,7 +1407,7 @@
             <w:color w:val="0563C1"/>
             <w:u w:val="single"/>
           </w:rPr>
-          <w:t>https://github.com/blur3773/devops-kr-mirror</w:t>
+          <w:t>https://gitlab.com/blur3773/devops-kr-mirror</w:t>
         </w:r>
       </w:hyperlink>
     </w:p>

</xml_diff>